<commit_message>
Prune the 21 uncited bib entries, and update the keywords
The bibliography carried 65 entries for 44 citations. The 21 the manuscript
never cites are removed: fatf-tbml, srfraud1-4, gpt4, gemini, xgboost, adasyn,
randomforests, dumitrescu, bakumenko, parkllm, attention, bert, doshivelez,
molnar and the four disc-* entries. None was cited by the submitted baseline
either, so nothing in the record loses a reference, and the compiled
bibliography is unchanged at 44 items.

The citation gate now reports a clean pass rather than a standing warning:
44 entries, 44 cited, 0 uncited, 0 without an identifier, 27/27 DOIs resolving
live.

Keywords replaced with the six supplied, in the manuscript, .zenodo.json and
CITATION.cff, so the paper, the deposit metadata and the citation file agree.
</commit_message>
<xml_diff>
--- a/paper/manuscript_full_tracked.docx
+++ b/paper/manuscript_full_tracked.docx
@@ -277,18 +277,9 @@
         <w:t xml:space="preserve"> </w:t>
       </w:r>
       <w:r>
-        <w:rPr>
-          <w:strike/>
-        </w:rPr>
-        <w:t xml:space="preserve">substituted, repriced or retired by providers, model identity and operating-point stability should be explicitly incorporated into model-risk governance, validation and ongoing monitoring.</w:t>
-      </w:r>
-      <w:r>
-        <w:t xml:space="preserve"> </w:t>
-      </w:r>
-      <w:r>
-        <w:rPr>
-          <w:highlight w:val="yellow"/>
-        </w:rPr>
+        <w:t xml:space="preserve"> </w:t>
+      </w:r>
+      <w:r>
         <w:t xml:space="preserve">substituted or retired by providers, model-tier substitution and alias redirection should be treated as first-class model-risk events, and operating-point stability monitored through a standing probe.</w:t>
       </w:r>
     </w:p>

</xml_diff>